<commit_message>
Add MECS2313 CI (original + updated docx/xlsx + checklist)
</commit_message>
<xml_diff>
--- a/courses/PG/MECS2313/updated/MECS2313_Advanced_Computer_System_and_Architecture_UPDATED.docx
+++ b/courses/PG/MECS2313/updated/MECS2313_Advanced_Computer_System_and_Architecture_UPDATED.docx
@@ -822,7 +822,7 @@
                 <w:sz w:val="18"/>
                 <w:szCs w:val="18"/>
               </w:rPr>
-              <w:t xml:space="preserve">A.P. Dr. Mohd Shahizan Othman</w:t>
+              <w:t xml:space="preserve">Ts. A.P. Dr. Mohd Murtadha bin Mohamad</w:t>
             </w:r>
           </w:p>
         </w:tc>
@@ -850,7 +850,7 @@
                 <w:sz w:val="18"/>
                 <w:szCs w:val="18"/>
               </w:rPr>
-              <w:t xml:space="preserve">N28A</w:t>
+              <w:t xml:space="preserve">D07</w:t>
             </w:r>
           </w:p>
         </w:tc>
@@ -878,7 +878,7 @@
                 <w:sz w:val="18"/>
                 <w:szCs w:val="18"/>
               </w:rPr>
-              <w:t xml:space="preserve">0127363269</w:t>
+              <w:t xml:space="preserve">0127018020</w:t>
             </w:r>
           </w:p>
         </w:tc>
@@ -906,7 +906,7 @@
                 <w:sz w:val="18"/>
                 <w:szCs w:val="18"/>
               </w:rPr>
-              <w:t xml:space="preserve">shahizan@utm.my</w:t>
+              <w:t xml:space="preserve">murtadha@utm.my</w:t>
             </w:r>
           </w:p>
         </w:tc>
@@ -6468,7 +6468,7 @@
                 <w:sz w:val="18"/>
                 <w:szCs w:val="18"/>
               </w:rPr>
-              <w:t xml:space="preserve">Name: ___________________</w:t>
+              <w:t xml:space="preserve">Name: Ts. A.P. Dr. Mohd Murtadha bin Mohamad</w:t>
             </w:r>
           </w:p>
         </w:tc>

</xml_diff>